<commit_message>
v22.17 (next.html): HR memo - switching the employee on a typed Amount forgets the old count figure, so emptying the count no longer blanks a typed amount that equals it (+P300 typed -> P0); Word guide regenerated
Reviewer follow-up on the HR memo count fix. New case in memo-hr-net (fails without the fix: amount 0).

Co-Authored-By: Claude Opus 5.5 <noreply@anthropic.com>
Claude-Session: https://claude.ai/code/session_01T49gnSNZq31rPRt1vHk4Rc
</commit_message>
<xml_diff>
--- a/nexidoc/Nexi_User_Guide_v22.17.docx
+++ b/nexidoc/Nexi_User_Guide_v22.17.docx
@@ -6371,7 +6371,7 @@
           </w:tcPr>
           <w:p>
             <w:r>
-              <w:t>Keeps the readings honest. An uncalibrated sensor is worse than no sensor.</w:t>
+              <w:t>Keeps the readings honest. An uncalibrated sensor is worse than no sensor. Last Cal. in 🔧 Sensor Inventory is the most recent calibration recorded on any computer: filling in an older day’s morning log never moves it back, and every change to a sensor (calibration, model, serial, install date, cycle) is dated, so the newer change reaches every computer, and a sensor removed on one computer is removed on the others too. A detail saved before v22.17 carries no date: when two computers hold different values for it, a filled-in value beats an empty one, otherwise each computer keeps its own until someone edits it there (v22.17).</w:t>
             </w:r>
           </w:p>
         </w:tc>
@@ -7697,6 +7697,11 @@
     </w:p>
     <w:p>
       <w:r>
+        <w:t>A save made while the browser store is full waits in memory for the background compressor. If you save again or delete that record before it finishes, your newer change is what stays; before, the older waiting copy could come back.</w:t>
+      </w:r>
+    </w:p>
+    <w:p>
+      <w:r>
         <w:t>If the cloud refuses a store because it is too big, Nexi keeps it as unsent on this computer and the sync line names it, instead of treating it as sent. A list whose records are named only by a username, an employee number or a plate number (no record id) could be emptied by a cloud download that differed from this computer’s copy; such lists now merge record by record. ⚙ TOOLS → 🩺 Nexi Health shows a 📦 line for each computer: how much of the browser store is used, how many stores live in the device database, and anything unsent.</w:t>
       </w:r>
     </w:p>
@@ -9114,6 +9119,77 @@
         <w:pStyle w:val="Heading2"/>
       </w:pPr>
       <w:r>
+        <w:t>How an individual (HR) memo’s amount is worked out (v22.17)</w:t>
+      </w:r>
+    </w:p>
+    <w:p>
+      <w:r>
+        <w:t>An individual memo is for one person. Its amount is one figure, and payroll pays or deducts exactly that figure: a positive amount on a 🌟 GOOD memo is paid, and a negative amount or a ⚠️ BAD memo is deducted. The notes are only text. Nexi does not count them.</w:t>
+      </w:r>
+    </w:p>
+    <w:p>
+      <w:r>
+        <w:t>When one memo covers several greenhouses with mixed results, use 🧮 Count under the Amount. Enter the commendations and the reprimands, either as numbers or by ticking the GHs. Each one is priced at the person’s ⚙ Memo rate, the same rate a GH memo pays them: Team Leader ₱150, Supervisor ₱100, Worker ₱100 unless an admin changed the table. The amount = commendations × rate − reprimands × rate. For example, a supervisor with 3 commendations and 2 memos gets 3 × +₱100 − 2 × ₱100 = +₱100, not +₱300. Nexi fills that into the Amount, shows each line and the net in 💰 Financial Impact, and makes the memo 🌟 GOOD when the net is a bonus or ⚠️ BAD when it is a deduction. A 🚧 WARNING memo stays a warning: the count is kept on it for the record, and payroll moves no money. If the notes already name the GHs, for example “Commendations (GH2, GH6, &amp; GH9)” and “Memos (GH5 &amp; GH10)”, a Use these counts button appears.</w:t>
+      </w:r>
+    </w:p>
+    <w:p>
+      <w:r>
+        <w:t>You can still type an amount yourself, because some memos are discretionary. The memo, the signing and the FINAL approval then say “typed by hand by @username”, and they give the count’s figure if it differs. If you then change the employee, your typed amount stays. The count is priced again at the new person’s rate and offers a Use button, for example Use +₱450 for a team leader with 3 commendations. An amount that came from the count is worked out again for the new person by itself. A counted memo says “computed: 3 × +₱100 − 2 × ₱100 = +₱100”. If the notes mention both commendations and memos but the amount was typed as one figure, the memo shows a warning so the approver can check it. If ⚙ Memo rates has ₱0 for the person’s tier, the count says so and you type the amount by hand.</w:t>
+      </w:r>
+    </w:p>
+    <w:p>
+      <w:pPr>
+        <w:pStyle w:val="ListNumber"/>
+      </w:pPr>
+      <w:r>
+        <w:t>Memos</w:t>
+      </w:r>
+    </w:p>
+    <w:p>
+      <w:pPr>
+        <w:pStyle w:val="ListNumber"/>
+      </w:pPr>
+      <w:r>
+        <w:t>👤 + HR Memo</w:t>
+      </w:r>
+    </w:p>
+    <w:p>
+      <w:pPr>
+        <w:pStyle w:val="ListNumber"/>
+      </w:pPr>
+      <w:r>
+        <w:t>pick the employee</w:t>
+      </w:r>
+    </w:p>
+    <w:p>
+      <w:pPr>
+        <w:pStyle w:val="ListNumber"/>
+      </w:pPr>
+      <w:r>
+        <w:t>🧮 Count: commendations and reprimands (or tick the GHs)</w:t>
+      </w:r>
+    </w:p>
+    <w:p>
+      <w:pPr>
+        <w:pStyle w:val="ListNumber"/>
+      </w:pPr>
+      <w:r>
+        <w:t>check 💰 Financial Impact</w:t>
+      </w:r>
+    </w:p>
+    <w:p>
+      <w:pPr>
+        <w:pStyle w:val="ListNumber"/>
+      </w:pPr>
+      <w:r>
+        <w:t>Save &amp; Request Signatures</w:t>
+      </w:r>
+    </w:p>
+    <w:p>
+      <w:pPr>
+        <w:pStyle w:val="Heading2"/>
+      </w:pPr>
+      <w:r>
         <w:t>Rejecting or cancelling a memo (v21.62)</w:t>
       </w:r>
     </w:p>
@@ -9269,49 +9345,17 @@
         <w:pStyle w:val="Heading2"/>
       </w:pPr>
       <w:r>
-        <w:t>Rate audit — what the office daily rate paid against what it should be (v21.45)</w:t>
-      </w:r>
-    </w:p>
-    <w:p>
-      <w:r>
-        <w:t>Payroll ▸ ⚖️ Rate audit is READ-ONLY evidence for a rule decision. The engine builds the office daily rate as half of the monthly basic ÷ the Mon–Fri scheduled days of the cut-off (less regular holidays), about monthly ÷ 22. The owner's rule is monthly basic ÷ the calendar days of the month minus its Sundays, about monthly ÷ 26. The screen takes every APPROVED office line of the year and shows both rates and, item by item, what was paid and what it should be: Sunday premium (paid 130% of the old rate; should = Sunday days × new rate × 100% — that day's basic — or 130%, chosen on the screen), a Saturday signed on a five-day card (paid as a 130% rest day; should = a plain basic day), holiday pay, tardiness and unauthorised-absence deductions (scaled to the new rate).</w:t>
-      </w:r>
-    </w:p>
-    <w:p>
-      <w:r>
-        <w:t>Δ = paid − should: orange positive = overpaid, teal negative = underpaid. Totals per person, per month and for the year; a cut-off that straddles two months uses the month holding most of its days. Weekly labour has no monthly basic and is not compared. Nothing is changed by this screen: approved runs are frozen and the engine rule stays until the owner decides; then the fix is a new version and the back-pay or recovery is a memo per person.</w:t>
-      </w:r>
-    </w:p>
-    <w:p>
-      <w:pPr>
-        <w:pStyle w:val="ListNumber"/>
-      </w:pPr>
-      <w:r>
-        <w:t>Payroll ▸ ⚖️ Rate audit</w:t>
-      </w:r>
-    </w:p>
-    <w:p>
-      <w:pPr>
-        <w:pStyle w:val="ListNumber"/>
-      </w:pPr>
-      <w:r>
-        <w:t>Pick the year and the Sunday % (100 or 130)</w:t>
-      </w:r>
-    </w:p>
-    <w:p>
-      <w:pPr>
-        <w:pStyle w:val="ListNumber"/>
-      </w:pPr>
-      <w:r>
-        <w:t>Click a name for every cut-off</w:t>
-      </w:r>
-    </w:p>
-    <w:p>
-      <w:pPr>
-        <w:pStyle w:val="ListNumber"/>
-      </w:pPr>
-      <w:r>
-        <w:t>⬇ Excel: By employee &amp; cut-off, By employee (year), By month, Notes</w:t>
+        <w:t>Rate audit — cancelled in v21.46; the office daily rate is unchanged</w:t>
+      </w:r>
+    </w:p>
+    <w:p>
+      <w:r>
+        <w:t>The ⚖️ Rate audit screen and its Excel, added in v21.45, were removed in v21.46 at Eyal's request ("cancel the new update"). There is no Rate audit item in the Payroll menu any more. It was read-only: it never changed a calculation or a payroll run.</w:t>
+      </w:r>
+    </w:p>
+    <w:p>
+      <w:r>
+        <w:t>The office daily rate stays as it was: half of the monthly basic ÷ the Mon–Fri scheduled days of the cut-off (less regular holidays). Example: ₱16,000 a month on the 11–25 Sep 2026 cut-off is 8,000 ÷ 11 days = ₱727.27 a day, and a Sunday signed in HR ▸ Weekend Approvals is paid at 130% of that rate, ₱945.45.</w:t>
       </w:r>
     </w:p>
     <w:p>
@@ -9824,6 +9868,21 @@
     <w:p>
       <w:r>
         <w:t>The warning that says “Sync replaced N entries” now opens this list by itself, instead of scrolling away before you can read it.</w:t>
+      </w:r>
+    </w:p>
+    <w:p>
+      <w:r>
+        <w:t>A line marked (duplicate id) means two copies of one record met and neither carried a date, so the merge could not tell which was newer (v22.17). The label says what happened: “kept this computer's copy; cloud copy set aside” (nothing changed here — Was is the cloud’s copy that was set aside, Became the copy this computer kept), “cloud copy replaced this computer's copy” (Was is what this computer had), “two copies on this computer” or “two cloud copies” (one kept, the other set aside), or “the two copies were combined”. Was and Became show only the fields that differ. Not listed: two copies that are the same apart from the order their fields were written in, a built-in default meeting a real record, and a record that is removed in the same merge.</w:t>
+      </w:r>
+    </w:p>
+    <w:p>
+      <w:r>
+        <w:t>Sensors (hydroPro_sensor_inventory_v1) are the exception: two undated copies of a sensor are combined field by field — the later calibration date, a filled-in serial or model over an empty one — and a line, “this computer's copy updated from the cloud copy”, is written only when that changed the copy on this computer. When this computer kept its own sensor copy, nothing is listed.</w:t>
+      </w:r>
+    </w:p>
+    <w:p>
+      <w:r>
+        <w:t>The sensor lines (hydroPro_sensor_inventory_v1, duplicate id) that filled this list before v22.17 were not changes: this computer had kept its own copy each time, and Was showed the other computer’s copy. They have been taken off the list. Sensor records are now dated and combined field by field, so the later calibration date reaches every computer and a sensor line appears only when this computer’s own copy changed.</w:t>
       </w:r>
     </w:p>
     <w:p>

</xml_diff>